<commit_message>
Update flow diagram: formal monochrome style with bold text, wider boxes, and restructured TOC
</commit_message>
<xml_diff>
--- a/DocClassifyExtract_Solution_Overview.docx
+++ b/DocClassifyExtract_Solution_Overview.docx
@@ -82,7 +82,7 @@
         <w:pStyle w:val="ListNumber"/>
       </w:pPr>
       <w:r>
-        <w:t>1. Solution Overview</w:t>
+        <w:t>1. End-to-End Data Flow Diagram</w:t>
       </w:r>
     </w:p>
     <w:p>
@@ -90,7 +90,7 @@
         <w:pStyle w:val="ListNumber"/>
       </w:pPr>
       <w:r>
-        <w:t>2. Architecture &amp; Services</w:t>
+        <w:t>2. Solution Overview</w:t>
       </w:r>
     </w:p>
     <w:p>
@@ -98,7 +98,7 @@
         <w:pStyle w:val="ListNumber"/>
       </w:pPr>
       <w:r>
-        <w:t>3. Document Classification Pipeline</w:t>
+        <w:t>3. Architecture &amp; Services</w:t>
       </w:r>
     </w:p>
     <w:p>
@@ -106,7 +106,7 @@
         <w:pStyle w:val="ListNumber"/>
       </w:pPr>
       <w:r>
-        <w:t>4. GPT-4.1 Confidence Scoring</w:t>
+        <w:t>4. Document Classification Pipeline</w:t>
       </w:r>
     </w:p>
     <w:p>
@@ -114,7 +114,7 @@
         <w:pStyle w:val="ListNumber"/>
       </w:pPr>
       <w:r>
-        <w:t>5. Field Extraction</w:t>
+        <w:t>5. GPT-4.1 Confidence Scoring</w:t>
       </w:r>
     </w:p>
     <w:p>
@@ -122,7 +122,7 @@
         <w:pStyle w:val="ListNumber"/>
       </w:pPr>
       <w:r>
-        <w:t>6. Database Persistence</w:t>
+        <w:t>6. Field Extraction</w:t>
       </w:r>
     </w:p>
     <w:p>
@@ -130,7 +130,7 @@
         <w:pStyle w:val="ListNumber"/>
       </w:pPr>
       <w:r>
-        <w:t>7. SME Assignment (Human-in-the-Loop)</w:t>
+        <w:t>7. Database Persistence</w:t>
       </w:r>
     </w:p>
     <w:p>
@@ -138,7 +138,7 @@
         <w:pStyle w:val="ListNumber"/>
       </w:pPr>
       <w:r>
-        <w:t>8. Blob Routing &amp; File Organization</w:t>
+        <w:t>8. SME Assignment (Human-in-the-Loop)</w:t>
       </w:r>
     </w:p>
     <w:p>
@@ -146,7 +146,7 @@
         <w:pStyle w:val="ListNumber"/>
       </w:pPr>
       <w:r>
-        <w:t>9. Document Categories &amp; Indicators</w:t>
+        <w:t>9. Blob Routing &amp; File Organization</w:t>
       </w:r>
     </w:p>
     <w:p>
@@ -154,7 +154,7 @@
         <w:pStyle w:val="ListNumber"/>
       </w:pPr>
       <w:r>
-        <w:t>10. End-to-End Flow Diagram</w:t>
+        <w:t>10. Document Categories &amp; Indicators</w:t>
       </w:r>
     </w:p>
     <w:p>
@@ -175,7 +175,145 @@
         <w:pStyle w:val="Heading1"/>
       </w:pPr>
       <w:r>
-        <w:t>1. Solution Overview</w:t>
+        <w:t>1. End-to-End Data Flow Diagram</w:t>
+      </w:r>
+    </w:p>
+    <w:p>
+      <w:pPr>
+        <w:jc w:val="center"/>
+      </w:pPr>
+      <w:r>
+        <w:drawing>
+          <wp:inline xmlns:a="http://schemas.openxmlformats.org/drawingml/2006/main" xmlns:pic="http://schemas.openxmlformats.org/drawingml/2006/picture">
+            <wp:extent cx="6400800" cy="8918608"/>
+            <wp:docPr id="1" name="Picture 1"/>
+            <wp:cNvGraphicFramePr>
+              <a:graphicFrameLocks noChangeAspect="1"/>
+            </wp:cNvGraphicFramePr>
+            <a:graphic>
+              <a:graphicData uri="http://schemas.openxmlformats.org/drawingml/2006/picture">
+                <pic:pic>
+                  <pic:nvPicPr>
+                    <pic:cNvPr id="0" name="data_flow_diagram.png"/>
+                    <pic:cNvPicPr/>
+                  </pic:nvPicPr>
+                  <pic:blipFill>
+                    <a:blip r:embed="rId9"/>
+                    <a:stretch>
+                      <a:fillRect/>
+                    </a:stretch>
+                  </pic:blipFill>
+                  <pic:spPr>
+                    <a:xfrm>
+                      <a:off x="0" y="0"/>
+                      <a:ext cx="6400800" cy="8918608"/>
+                    </a:xfrm>
+                    <a:prstGeom prst="rect"/>
+                  </pic:spPr>
+                </pic:pic>
+              </a:graphicData>
+            </a:graphic>
+          </wp:inline>
+        </w:drawing>
+      </w:r>
+    </w:p>
+    <w:p/>
+    <w:p>
+      <w:pPr>
+        <w:pStyle w:val="Heading2"/>
+      </w:pPr>
+      <w:r>
+        <w:t>How It Works</w:t>
+      </w:r>
+    </w:p>
+    <w:p>
+      <w:r>
+        <w:rPr>
+          <w:b/>
+        </w:rPr>
+        <w:t xml:space="preserve">1. Upload: </w:t>
+      </w:r>
+      <w:r>
+        <w:t>Drop a PDF into Azure Blob Storage — processing starts automatically.</w:t>
+      </w:r>
+    </w:p>
+    <w:p>
+      <w:r>
+        <w:rPr>
+          <w:b/>
+        </w:rPr>
+        <w:t xml:space="preserve">2. Classify: </w:t>
+      </w:r>
+      <w:r>
+        <w:t>Azure AI identifies the document type: CRE Loan, Valuation Report, or C&amp;I Agreement.</w:t>
+      </w:r>
+    </w:p>
+    <w:p>
+      <w:r>
+        <w:rPr>
+          <w:b/>
+        </w:rPr>
+        <w:t xml:space="preserve">3. Validate: </w:t>
+      </w:r>
+      <w:r>
+        <w:t>GPT-4.1 confirms the classification with a confidence score. Documents below 70% are flagged for human review.</w:t>
+      </w:r>
+    </w:p>
+    <w:p>
+      <w:r>
+        <w:rPr>
+          <w:b/>
+        </w:rPr>
+        <w:t xml:space="preserve">4. Extract: </w:t>
+      </w:r>
+      <w:r>
+        <w:t>AI extracts key fields (dates, names, amounts, terms) with page-level citations showing exactly where each value was found.</w:t>
+      </w:r>
+    </w:p>
+    <w:p>
+      <w:r>
+        <w:rPr>
+          <w:b/>
+        </w:rPr>
+        <w:t xml:space="preserve">5. Store: </w:t>
+      </w:r>
+      <w:r>
+        <w:t>All extracted data is saved to Azure SQL with full audit trail.</w:t>
+      </w:r>
+    </w:p>
+    <w:p>
+      <w:r>
+        <w:rPr>
+          <w:b/>
+        </w:rPr>
+        <w:t xml:space="preserve">6. Assign: </w:t>
+      </w:r>
+      <w:r>
+        <w:t>Documents needing review are automatically assigned to the right SME via round-robin.</w:t>
+      </w:r>
+    </w:p>
+    <w:p>
+      <w:r>
+        <w:rPr>
+          <w:b/>
+        </w:rPr>
+        <w:t xml:space="preserve">7. Route: </w:t>
+      </w:r>
+      <w:r>
+        <w:t>The PDF is moved to an organized folder and renamed for easy identification.</w:t>
+      </w:r>
+    </w:p>
+    <w:p>
+      <w:r>
+        <w:br w:type="page"/>
+      </w:r>
+    </w:p>
+    <w:p>
+      <w:pPr>
+        <w:pStyle w:val="Heading1"/>
+      </w:pPr>
+      <w:r>
+        <w:t>2. Solution Overview</w:t>
       </w:r>
     </w:p>
     <w:p>
@@ -266,7 +404,7 @@
         <w:pStyle w:val="Heading1"/>
       </w:pPr>
       <w:r>
-        <w:t>2. Architecture &amp; Services</w:t>
+        <w:t>3. Architecture &amp; Services</w:t>
       </w:r>
     </w:p>
     <w:p>
@@ -600,7 +738,7 @@
         <w:pStyle w:val="Heading1"/>
       </w:pPr>
       <w:r>
-        <w:t>3. Document Classification Pipeline</w:t>
+        <w:t>4. Document Classification Pipeline</w:t>
       </w:r>
     </w:p>
     <w:p>
@@ -735,7 +873,7 @@
         <w:pStyle w:val="Heading1"/>
       </w:pPr>
       <w:r>
-        <w:t>4. GPT-4.1 Confidence Scoring</w:t>
+        <w:t>5. GPT-4.1 Confidence Scoring</w:t>
       </w:r>
     </w:p>
     <w:p>
@@ -1015,7 +1153,7 @@
         <w:pStyle w:val="Heading1"/>
       </w:pPr>
       <w:r>
-        <w:t>5. Field Extraction</w:t>
+        <w:t>6. Field Extraction</w:t>
       </w:r>
     </w:p>
     <w:p>
@@ -1277,7 +1415,7 @@
         <w:pStyle w:val="Heading1"/>
       </w:pPr>
       <w:r>
-        <w:t>6. Database Persistence</w:t>
+        <w:t>7. Database Persistence</w:t>
       </w:r>
     </w:p>
     <w:p>
@@ -1425,7 +1563,7 @@
         <w:pStyle w:val="Heading1"/>
       </w:pPr>
       <w:r>
-        <w:t>7. SME Assignment (Human-in-the-Loop)</w:t>
+        <w:t>8. SME Assignment (Human-in-the-Loop)</w:t>
       </w:r>
     </w:p>
     <w:p>
@@ -1521,7 +1659,7 @@
         <w:pStyle w:val="Heading1"/>
       </w:pPr>
       <w:r>
-        <w:t>8. Blob Routing &amp; File Organization</w:t>
+        <w:t>9. Blob Routing &amp; File Organization</w:t>
       </w:r>
     </w:p>
     <w:p>
@@ -1692,7 +1830,7 @@
         <w:pStyle w:val="Heading1"/>
       </w:pPr>
       <w:r>
-        <w:t>9. Document Categories &amp; Indicators</w:t>
+        <w:t>10. Document Categories &amp; Indicators</w:t>
       </w:r>
     </w:p>
     <w:p>
@@ -1942,305 +2080,6 @@
         <w:t>Documents that do not clearly fall into CRE, CNI, or Valuation. These are automatically flagged for human intervention with no extraction performed.</w:t>
       </w:r>
     </w:p>
-    <w:p>
-      <w:r>
-        <w:br w:type="page"/>
-      </w:r>
-    </w:p>
-    <w:p>
-      <w:pPr>
-        <w:pStyle w:val="Heading1"/>
-      </w:pPr>
-      <w:r>
-        <w:t>10. End-to-End Flow Diagram</w:t>
-      </w:r>
-    </w:p>
-    <w:p>
-      <w:r>
-        <w:t>The following describes the complete processing pipeline from document upload to final storage:</w:t>
-      </w:r>
-    </w:p>
-    <w:p>
-      <w:r>
-        <w:rPr>
-          <w:b/>
-        </w:rPr>
-        <w:t xml:space="preserve">Step 1: Upload: </w:t>
-      </w:r>
-      <w:r>
-        <w:t>Document is uploaded to Azure Blob Storage (genpact/incoming-documents/)</w:t>
-      </w:r>
-    </w:p>
-    <w:p>
-      <w:r>
-        <w:rPr>
-          <w:b/>
-        </w:rPr>
-        <w:t xml:space="preserve">Step 2: Trigger: </w:t>
-      </w:r>
-      <w:r>
-        <w:t>Azure Function is automatically triggered by the blob upload event</w:t>
-      </w:r>
-    </w:p>
-    <w:p>
-      <w:r>
-        <w:rPr>
-          <w:b/>
-        </w:rPr>
-        <w:t xml:space="preserve">Step 3: Classify: </w:t>
-      </w:r>
-      <w:r>
-        <w:t>Document is submitted to Azure Content Understanding classifier API</w:t>
-      </w:r>
-    </w:p>
-    <w:p>
-      <w:r>
-        <w:rPr>
-          <w:b/>
-        </w:rPr>
-        <w:t xml:space="preserve">Step 4: Parse Results: </w:t>
-      </w:r>
-      <w:r>
-        <w:t>Classification returns category (CRE/CNI/Valuation/Other) + native confidence per segment</w:t>
-      </w:r>
-    </w:p>
-    <w:p>
-      <w:r>
-        <w:rPr>
-          <w:b/>
-        </w:rPr>
-        <w:t xml:space="preserve">Step 5: GPT Validation: </w:t>
-      </w:r>
-      <w:r>
-        <w:t>GPT-4.1 validates each segment's classification by analyzing document indicators</w:t>
-      </w:r>
-    </w:p>
-    <w:p>
-      <w:r>
-        <w:rPr>
-          <w:b/>
-        </w:rPr>
-        <w:t xml:space="preserve">Step 6: Confidence Gate: </w:t>
-      </w:r>
-      <w:r>
-        <w:t>If GPT score ≥ 70%: proceed | If &lt; 70% or "Other": flag for human intervention</w:t>
-      </w:r>
-    </w:p>
-    <w:p>
-      <w:r>
-        <w:rPr>
-          <w:b/>
-        </w:rPr>
-        <w:t xml:space="preserve">Step 7: Extract Fields: </w:t>
-      </w:r>
-      <w:r>
-        <w:t>Document is sent to the appropriate extraction analyzer (per document type)</w:t>
-      </w:r>
-    </w:p>
-    <w:p>
-      <w:r>
-        <w:rPr>
-          <w:b/>
-        </w:rPr>
-        <w:t xml:space="preserve">Step 8: Parse &amp; Enrich: </w:t>
-      </w:r>
-      <w:r>
-        <w:t>Raw extraction results are parsed into structured fields with citations and confidence</w:t>
-      </w:r>
-    </w:p>
-    <w:p>
-      <w:r>
-        <w:rPr>
-          <w:b/>
-        </w:rPr>
-        <w:t xml:space="preserve">Step 9: Save to DB: </w:t>
-      </w:r>
-      <w:r>
-        <w:t>All fields and job metadata are persisted to Azure SQL Server</w:t>
-      </w:r>
-    </w:p>
-    <w:p>
-      <w:r>
-        <w:rPr>
-          <w:b/>
-        </w:rPr>
-        <w:t xml:space="preserve">Step 10: SME Assignment: </w:t>
-      </w:r>
-      <w:r>
-        <w:t>If any field needs HITL review, document is assigned to an SME via round-robin</w:t>
-      </w:r>
-    </w:p>
-    <w:p>
-      <w:r>
-        <w:rPr>
-          <w:b/>
-        </w:rPr>
-        <w:t xml:space="preserve">Step 11: Route Blob: </w:t>
-      </w:r>
-      <w:r>
-        <w:t>Document is moved from incoming-documents/ to the classified folder</w:t>
-      </w:r>
-    </w:p>
-    <w:p>
-      <w:r>
-        <w:rPr>
-          <w:b/>
-        </w:rPr>
-        <w:t xml:space="preserve">Step 12: Complete: </w:t>
-      </w:r>
-      <w:r>
-        <w:t>Processing complete — full audit trail available in database</w:t>
-      </w:r>
-    </w:p>
-    <w:p/>
-    <w:p>
-      <w:pPr>
-        <w:pStyle w:val="Heading2"/>
-      </w:pPr>
-      <w:r>
-        <w:t>Decision Points</w:t>
-      </w:r>
-    </w:p>
-    <w:tbl>
-      <w:tblPr>
-        <w:tblStyle w:val="MediumShading1-Accent1"/>
-        <w:tblW w:type="auto" w:w="0"/>
-        <w:tblLook w:firstColumn="1" w:firstRow="1" w:lastColumn="0" w:lastRow="0" w:noHBand="0" w:noVBand="1" w:val="04A0"/>
-      </w:tblPr>
-      <w:tblGrid>
-        <w:gridCol w:w="2880"/>
-        <w:gridCol w:w="2880"/>
-        <w:gridCol w:w="2880"/>
-      </w:tblGrid>
-      <w:tr>
-        <w:tc>
-          <w:tcPr>
-            <w:tcW w:type="dxa" w:w="2880"/>
-          </w:tcPr>
-          <w:p>
-            <w:r>
-              <w:t>Decision</w:t>
-            </w:r>
-          </w:p>
-        </w:tc>
-        <w:tc>
-          <w:tcPr>
-            <w:tcW w:type="dxa" w:w="2880"/>
-          </w:tcPr>
-          <w:p>
-            <w:r>
-              <w:t>Condition</w:t>
-            </w:r>
-          </w:p>
-        </w:tc>
-        <w:tc>
-          <w:tcPr>
-            <w:tcW w:type="dxa" w:w="2880"/>
-          </w:tcPr>
-          <w:p>
-            <w:r>
-              <w:t>Action</w:t>
-            </w:r>
-          </w:p>
-        </w:tc>
-      </w:tr>
-      <w:tr>
-        <w:tc>
-          <w:tcPr>
-            <w:tcW w:type="dxa" w:w="2880"/>
-          </w:tcPr>
-          <w:p>
-            <w:r>
-              <w:t>Category = "Other"</w:t>
-            </w:r>
-          </w:p>
-        </w:tc>
-        <w:tc>
-          <w:tcPr>
-            <w:tcW w:type="dxa" w:w="2880"/>
-          </w:tcPr>
-          <w:p>
-            <w:r>
-              <w:t>Classifier assigns unknown category</w:t>
-            </w:r>
-          </w:p>
-        </w:tc>
-        <w:tc>
-          <w:tcPr>
-            <w:tcW w:type="dxa" w:w="2880"/>
-          </w:tcPr>
-          <w:p>
-            <w:r>
-              <w:t>Skip extraction → Human intervention</w:t>
-            </w:r>
-          </w:p>
-        </w:tc>
-      </w:tr>
-      <w:tr>
-        <w:tc>
-          <w:tcPr>
-            <w:tcW w:type="dxa" w:w="2880"/>
-          </w:tcPr>
-          <w:p>
-            <w:r>
-              <w:t>GPT Score &lt; 70%</w:t>
-            </w:r>
-          </w:p>
-        </w:tc>
-        <w:tc>
-          <w:tcPr>
-            <w:tcW w:type="dxa" w:w="2880"/>
-          </w:tcPr>
-          <w:p>
-            <w:r>
-              <w:t>Low confidence in classification</w:t>
-            </w:r>
-          </w:p>
-        </w:tc>
-        <w:tc>
-          <w:tcPr>
-            <w:tcW w:type="dxa" w:w="2880"/>
-          </w:tcPr>
-          <w:p>
-            <w:r>
-              <w:t>Skip extraction → Human intervention</w:t>
-            </w:r>
-          </w:p>
-        </w:tc>
-      </w:tr>
-      <w:tr>
-        <w:tc>
-          <w:tcPr>
-            <w:tcW w:type="dxa" w:w="2880"/>
-          </w:tcPr>
-          <w:p>
-            <w:r>
-              <w:t>Field Confidence &lt; 0.5</w:t>
-            </w:r>
-          </w:p>
-        </w:tc>
-        <w:tc>
-          <w:tcPr>
-            <w:tcW w:type="dxa" w:w="2880"/>
-          </w:tcPr>
-          <w:p>
-            <w:r>
-              <w:t>Extracted value uncertain</w:t>
-            </w:r>
-          </w:p>
-        </w:tc>
-        <w:tc>
-          <w:tcPr>
-            <w:tcW w:type="dxa" w:w="2880"/>
-          </w:tcPr>
-          <w:p>
-            <w:r>
-              <w:t>Flag field for HITL review, assign to SME</w:t>
-            </w:r>
-          </w:p>
-        </w:tc>
-      </w:tr>
-    </w:tbl>
     <w:p>
       <w:r>
         <w:br w:type="page"/>

</xml_diff>